<commit_message>
doc(rapport): Fin du rapport
</commit_message>
<xml_diff>
--- a/Doc/Rapport secured_webshop.docx
+++ b/Doc/Rapport secured_webshop.docx
@@ -35,7 +35,7 @@
           <w:noProof/>
         </w:rPr>
         <w:drawing>
-          <wp:inline distT="0" distB="0" distL="0" distR="0" wp14:anchorId="4849472F" wp14:editId="12E3C03F">
+          <wp:inline distT="0" distB="0" distL="0" distR="0" wp14:anchorId="4849472F" wp14:editId="07504F2C">
             <wp:extent cx="5759450" cy="3051175"/>
             <wp:effectExtent l="0" t="0" r="0" b="0"/>
             <wp:docPr id="1985218687" name="Image 1" descr="fondo de tecnología moderna 12038278 Vector en Vecteezy"/>
@@ -2421,9 +2421,9 @@
       <w:pPr>
         <w:pStyle w:val="Titre2"/>
       </w:pPr>
-      <w:bookmarkStart w:id="3" w:name="_Toc532179969"/>
-      <w:bookmarkStart w:id="4" w:name="_Toc165969639"/>
-      <w:bookmarkStart w:id="5" w:name="_Toc230167516"/>
+      <w:bookmarkStart w:id="3" w:name="_Toc230167516"/>
+      <w:bookmarkStart w:id="4" w:name="_Toc532179969"/>
+      <w:bookmarkStart w:id="5" w:name="_Toc165969639"/>
       <w:r>
         <w:t>T</w:t>
       </w:r>
@@ -2433,7 +2433,7 @@
       <w:r>
         <w:t>e</w:t>
       </w:r>
-      <w:bookmarkEnd w:id="5"/>
+      <w:bookmarkEnd w:id="3"/>
     </w:p>
     <w:p>
       <w:pPr>
@@ -2654,15 +2654,7 @@
         <w:t>les champs</w:t>
       </w:r>
       <w:r>
-        <w:t xml:space="preserve"> ou l’on peut remplir </w:t>
-      </w:r>
-      <w:proofErr w:type="gramStart"/>
-      <w:r>
-        <w:t>l’email</w:t>
-      </w:r>
-      <w:proofErr w:type="gramEnd"/>
-      <w:r>
-        <w:t xml:space="preserve">, le mot de passe et le bouton envoyer pour envoyer </w:t>
+        <w:t xml:space="preserve"> ou l’on peut remplir l’email, le mot de passe et le bouton envoyer pour envoyer </w:t>
       </w:r>
       <w:r>
         <w:t>les saisies</w:t>
@@ -2720,23 +2712,13 @@
         <w:br/>
       </w:r>
       <w:r>
-        <w:t xml:space="preserve">J'ai ensuite codé un script pour récupérer </w:t>
-      </w:r>
-      <w:proofErr w:type="gramStart"/>
-      <w:r>
-        <w:t>l'email</w:t>
-      </w:r>
-      <w:proofErr w:type="gramEnd"/>
-      <w:r>
-        <w:t xml:space="preserve"> et le mot de passe dès que l'utilisateur valide le formulaire. Pour éviter que la page ne s'actualise, j'utilise </w:t>
+        <w:t xml:space="preserve">J'ai ensuite codé un script pour récupérer l'email et le mot de passe dès que l'utilisateur valide le formulaire. Pour éviter que la page ne s'actualise, j'utilise </w:t>
       </w:r>
       <w:proofErr w:type="spellStart"/>
-      <w:proofErr w:type="gramStart"/>
       <w:r>
         <w:t>e.preventDefault</w:t>
       </w:r>
       <w:proofErr w:type="spellEnd"/>
-      <w:proofErr w:type="gramEnd"/>
       <w:r>
         <w:t xml:space="preserve">(). Enfin, j'envoie ces informations au serveur avec </w:t>
       </w:r>
@@ -2841,12 +2823,10 @@
         <w:t xml:space="preserve"> précis pour que le backend puisse récupérer les données (via </w:t>
       </w:r>
       <w:proofErr w:type="spellStart"/>
-      <w:proofErr w:type="gramStart"/>
       <w:r>
         <w:t>req.body</w:t>
       </w:r>
       <w:proofErr w:type="spellEnd"/>
-      <w:proofErr w:type="gramEnd"/>
       <w:r>
         <w:t>) sans erreur.</w:t>
       </w:r>
@@ -2877,12 +2857,10 @@
         <w:t xml:space="preserve"> dans la fonction </w:t>
       </w:r>
       <w:proofErr w:type="spellStart"/>
-      <w:proofErr w:type="gramStart"/>
       <w:r>
         <w:t>bcrypt.hash</w:t>
       </w:r>
       <w:proofErr w:type="spellEnd"/>
-      <w:proofErr w:type="gramEnd"/>
       <w:r>
         <w:t xml:space="preserve">() pour générer une empreinte chiffrée unique que j'insère ensuite en base de données. De cette manière, même en cas de fuite, les données restent illisibles. Lors de </w:t>
       </w:r>
@@ -2891,12 +2869,10 @@
         <w:t xml:space="preserve">la connexion, il me suffit d'utiliser </w:t>
       </w:r>
       <w:proofErr w:type="spellStart"/>
-      <w:proofErr w:type="gramStart"/>
       <w:r>
         <w:t>bcrypt.compare</w:t>
       </w:r>
       <w:proofErr w:type="spellEnd"/>
-      <w:proofErr w:type="gramEnd"/>
       <w:r>
         <w:t>() pour vérifier que le mot de passe saisi correspond bien au hash stocké, garantissant ainsi une sécurité maximale sans jamais manipuler le mot de passe brut.</w:t>
       </w:r>
@@ -2931,12 +2907,10 @@
         <w:t xml:space="preserve"> généré automatiquement par </w:t>
       </w:r>
       <w:proofErr w:type="spellStart"/>
-      <w:proofErr w:type="gramStart"/>
       <w:r>
         <w:t>bcrypt.hash</w:t>
       </w:r>
       <w:proofErr w:type="spellEnd"/>
-      <w:proofErr w:type="gramEnd"/>
       <w:r>
         <w:t xml:space="preserve">(). L'idée est de rendre chaque hash unique : même si deux utilisateurs choisissent le même mot de passe, leurs empreintes en base de données seront totalement différentes. Comme ce sel est directement intégré dans le hash final, cela bloque les attaques par tables </w:t>
       </w:r>
@@ -2978,6 +2952,9 @@
         <w:pStyle w:val="Retraitcorpsdetexte3"/>
       </w:pPr>
       <w:r>
+        <w:rPr>
+          <w:noProof/>
+        </w:rPr>
         <w:drawing>
           <wp:inline distT="0" distB="0" distL="0" distR="0" wp14:anchorId="00C00C24" wp14:editId="629E656B">
             <wp:extent cx="3581900" cy="238158"/>
@@ -3020,6 +2997,9 @@
         <w:pStyle w:val="Retraitcorpsdetexte3"/>
       </w:pPr>
       <w:r>
+        <w:rPr>
+          <w:noProof/>
+        </w:rPr>
         <w:drawing>
           <wp:inline distT="0" distB="0" distL="0" distR="0" wp14:anchorId="2D138D73" wp14:editId="622636F0">
             <wp:extent cx="2067213" cy="200053"/>
@@ -3062,18 +3042,13 @@
         <w:pStyle w:val="Retraitcorpsdetexte3"/>
       </w:pPr>
       <w:r>
-        <w:t xml:space="preserve">J’ai créé le poivre dans </w:t>
-      </w:r>
-      <w:proofErr w:type="gramStart"/>
-      <w:r>
-        <w:t>le .</w:t>
+        <w:t>J’ai créé le poivre dans le .</w:t>
       </w:r>
       <w:proofErr w:type="spellStart"/>
       <w:r>
         <w:t>env</w:t>
       </w:r>
       <w:proofErr w:type="spellEnd"/>
-      <w:proofErr w:type="gramEnd"/>
       <w:r>
         <w:t xml:space="preserve"> puis je l’ai ajouter au mot de passe avant le hash</w:t>
       </w:r>
@@ -3096,6 +3071,9 @@
         <w:pStyle w:val="Retraitcorpsdetexte3"/>
       </w:pPr>
       <w:r>
+        <w:rPr>
+          <w:noProof/>
+        </w:rPr>
         <w:drawing>
           <wp:inline distT="0" distB="0" distL="0" distR="0" wp14:anchorId="678E700E" wp14:editId="5E6DADB7">
             <wp:extent cx="3991532" cy="266737"/>
@@ -3138,6 +3116,9 @@
         <w:pStyle w:val="Retraitcorpsdetexte3"/>
       </w:pPr>
       <w:r>
+        <w:rPr>
+          <w:noProof/>
+        </w:rPr>
         <w:drawing>
           <wp:inline distT="0" distB="0" distL="0" distR="0" wp14:anchorId="61287621" wp14:editId="6848BBCF">
             <wp:extent cx="5229955" cy="190527"/>
@@ -3262,7 +3243,6 @@
         <w:t xml:space="preserve"> afin de gérer l’authentification de manière totalement décentralisée et éviter de stocker des sessions sur le </w:t>
       </w:r>
       <w:proofErr w:type="spellStart"/>
-      <w:proofErr w:type="gramStart"/>
       <w:r>
         <w:rPr>
           <w:rFonts w:asciiTheme="minorHAnsi" w:hAnsiTheme="minorHAnsi"/>
@@ -3272,7 +3252,6 @@
         <w:t>serveur.Au</w:t>
       </w:r>
       <w:proofErr w:type="spellEnd"/>
-      <w:proofErr w:type="gramEnd"/>
       <w:r>
         <w:rPr>
           <w:rFonts w:asciiTheme="minorHAnsi" w:hAnsiTheme="minorHAnsi"/>
@@ -3387,7 +3366,6 @@
         <w:t xml:space="preserve">, ce qui garantit que personne ne peut falsifier les données côté client. Pour sécuriser les accès, le middleware </w:t>
       </w:r>
       <w:proofErr w:type="spellStart"/>
-      <w:proofErr w:type="gramStart"/>
       <w:r>
         <w:rPr>
           <w:rFonts w:asciiTheme="minorHAnsi" w:hAnsiTheme="minorHAnsi"/>
@@ -3403,151 +3381,134 @@
           <w:sz w:val="20"/>
           <w:szCs w:val="16"/>
         </w:rPr>
-        <w:t>(</w:t>
-      </w:r>
-      <w:proofErr w:type="gramEnd"/>
+        <w:t xml:space="preserve">() intercepte les requêtes sur les routes protégées (comme sur le profil ou le panel admin), extrait le jeton du header </w:t>
+      </w:r>
+      <w:proofErr w:type="spellStart"/>
       <w:r>
         <w:rPr>
           <w:rFonts w:asciiTheme="minorHAnsi" w:hAnsiTheme="minorHAnsi"/>
           <w:sz w:val="20"/>
           <w:szCs w:val="16"/>
         </w:rPr>
-        <w:t xml:space="preserve">) intercepte les requêtes sur les routes protégées (comme sur le profil ou le panel admin), extrait le jeton du header </w:t>
-      </w:r>
-      <w:proofErr w:type="spellStart"/>
+        <w:t>Authorization</w:t>
+      </w:r>
+      <w:proofErr w:type="spellEnd"/>
       <w:r>
         <w:rPr>
           <w:rFonts w:asciiTheme="minorHAnsi" w:hAnsiTheme="minorHAnsi"/>
           <w:sz w:val="20"/>
           <w:szCs w:val="16"/>
         </w:rPr>
-        <w:t>Authorization</w:t>
-      </w:r>
-      <w:proofErr w:type="spellEnd"/>
+        <w:t xml:space="preserve">: </w:t>
+      </w:r>
+      <w:proofErr w:type="spellStart"/>
       <w:r>
         <w:rPr>
           <w:rFonts w:asciiTheme="minorHAnsi" w:hAnsiTheme="minorHAnsi"/>
           <w:sz w:val="20"/>
           <w:szCs w:val="16"/>
         </w:rPr>
-        <w:t xml:space="preserve">: </w:t>
-      </w:r>
-      <w:proofErr w:type="spellStart"/>
+        <w:t>Bearer</w:t>
+      </w:r>
+      <w:proofErr w:type="spellEnd"/>
       <w:r>
         <w:rPr>
           <w:rFonts w:asciiTheme="minorHAnsi" w:hAnsiTheme="minorHAnsi"/>
           <w:sz w:val="20"/>
           <w:szCs w:val="16"/>
         </w:rPr>
-        <w:t>Bearer</w:t>
-      </w:r>
-      <w:proofErr w:type="spellEnd"/>
+        <w:t xml:space="preserve"> et le valide avec </w:t>
+      </w:r>
+      <w:proofErr w:type="spellStart"/>
       <w:r>
         <w:rPr>
           <w:rFonts w:asciiTheme="minorHAnsi" w:hAnsiTheme="minorHAnsi"/>
           <w:sz w:val="20"/>
           <w:szCs w:val="16"/>
         </w:rPr>
-        <w:t xml:space="preserve"> et le valide avec </w:t>
-      </w:r>
-      <w:proofErr w:type="spellStart"/>
+        <w:t>jwt.verify</w:t>
+      </w:r>
+      <w:proofErr w:type="spellEnd"/>
       <w:r>
         <w:rPr>
           <w:rFonts w:asciiTheme="minorHAnsi" w:hAnsiTheme="minorHAnsi"/>
           <w:sz w:val="20"/>
           <w:szCs w:val="16"/>
         </w:rPr>
-        <w:t>jwt.verify</w:t>
-      </w:r>
-      <w:proofErr w:type="spellEnd"/>
+        <w:t xml:space="preserve">(). Si la signature est bonne, le contenu décodé est directement injecté dans </w:t>
+      </w:r>
+      <w:proofErr w:type="spellStart"/>
       <w:r>
         <w:rPr>
           <w:rFonts w:asciiTheme="minorHAnsi" w:hAnsiTheme="minorHAnsi"/>
           <w:sz w:val="20"/>
           <w:szCs w:val="16"/>
         </w:rPr>
-        <w:t xml:space="preserve">(). Si la signature est bonne, le contenu décodé est directement injecté dans </w:t>
-      </w:r>
-      <w:proofErr w:type="spellStart"/>
+        <w:t>req.user</w:t>
+      </w:r>
+      <w:proofErr w:type="spellEnd"/>
       <w:r>
         <w:rPr>
           <w:rFonts w:asciiTheme="minorHAnsi" w:hAnsiTheme="minorHAnsi"/>
           <w:sz w:val="20"/>
           <w:szCs w:val="16"/>
         </w:rPr>
-        <w:t>req.user</w:t>
+        <w:t>, ce qui permet aux contrôleurs suivants de savoir instantanément quel utilisateur fait la requête et d'agir en conséquence.</w:t>
+      </w:r>
+    </w:p>
+    <w:p>
+      <w:pPr>
+        <w:rPr>
+          <w:szCs w:val="16"/>
+        </w:rPr>
+      </w:pPr>
+      <w:r>
+        <w:br w:type="page"/>
+      </w:r>
+    </w:p>
+    <w:p>
+      <w:pPr>
+        <w:pStyle w:val="Retraitcorpsdetexte3"/>
+      </w:pPr>
+    </w:p>
+    <w:p>
+      <w:pPr>
+        <w:pStyle w:val="Titre3"/>
+      </w:pPr>
+      <w:bookmarkStart w:id="17" w:name="_Toc230167528"/>
+      <w:r>
+        <w:t>Ajouter les rôles administrateur et utilisateur dans le JWT et protéger les routes d’administration</w:t>
+      </w:r>
+      <w:bookmarkEnd w:id="17"/>
+    </w:p>
+    <w:p>
+      <w:pPr>
+        <w:pStyle w:val="Retraitcorpsdetexte3"/>
+      </w:pPr>
+      <w:r>
+        <w:t xml:space="preserve">Pour gérer les accès, </w:t>
+      </w:r>
+      <w:r>
+        <w:t>j’ai</w:t>
+      </w:r>
+      <w:r>
+        <w:t xml:space="preserve"> intègre directement le rôle du user dans le </w:t>
+      </w:r>
+      <w:proofErr w:type="spellStart"/>
+      <w:r>
+        <w:t>payload</w:t>
       </w:r>
       <w:proofErr w:type="spellEnd"/>
       <w:r>
-        <w:rPr>
-          <w:rFonts w:asciiTheme="minorHAnsi" w:hAnsiTheme="minorHAnsi"/>
-          <w:sz w:val="20"/>
-          <w:szCs w:val="16"/>
-        </w:rPr>
-        <w:t>, ce qui permet aux contrôleurs suivants de savoir instantanément quel utilisateur fait la requête et d'agir en conséquence.</w:t>
-      </w:r>
-    </w:p>
-    <w:p>
-      <w:pPr>
-        <w:rPr>
-          <w:szCs w:val="16"/>
-        </w:rPr>
-      </w:pPr>
-      <w:r>
-        <w:br w:type="page"/>
-      </w:r>
-    </w:p>
-    <w:p>
-      <w:pPr>
-        <w:pStyle w:val="Retraitcorpsdetexte3"/>
-      </w:pPr>
-    </w:p>
-    <w:p>
-      <w:pPr>
-        <w:pStyle w:val="Titre3"/>
-      </w:pPr>
-      <w:bookmarkStart w:id="17" w:name="_Toc230167528"/>
-      <w:r>
-        <w:t>Ajouter les rôles administrateur et utilisateur dans le JWT et protéger les routes d’administration</w:t>
-      </w:r>
-      <w:bookmarkEnd w:id="17"/>
-    </w:p>
-    <w:p>
-      <w:pPr>
-        <w:pStyle w:val="Retraitcorpsdetexte3"/>
-      </w:pPr>
-      <w:r>
-        <w:t xml:space="preserve">Pour gérer les accès, </w:t>
-      </w:r>
-      <w:r>
-        <w:t>j’ai</w:t>
-      </w:r>
-      <w:r>
-        <w:t xml:space="preserve"> intègre directement le rôle du user dans le </w:t>
+        <w:t xml:space="preserve"> du JWT (id, email, </w:t>
       </w:r>
       <w:proofErr w:type="spellStart"/>
       <w:r>
-        <w:t>payload</w:t>
+        <w:t>role</w:t>
       </w:r>
       <w:proofErr w:type="spellEnd"/>
       <w:r>
-        <w:t xml:space="preserve"> du JWT (id, email, </w:t>
-      </w:r>
-      <w:proofErr w:type="spellStart"/>
-      <w:r>
-        <w:t>role</w:t>
-      </w:r>
-      <w:proofErr w:type="spellEnd"/>
-      <w:r>
-        <w:t xml:space="preserve">) dès le </w:t>
-      </w:r>
-      <w:proofErr w:type="gramStart"/>
-      <w:r>
-        <w:t>login(</w:t>
-      </w:r>
-      <w:proofErr w:type="gramEnd"/>
-      <w:r>
-        <w:t>), ce qui évite de retaper dans la base de données après.</w:t>
+        <w:t>) dès le login(), ce qui évite de retaper dans la base de données après.</w:t>
       </w:r>
     </w:p>
     <w:p>
@@ -3567,17 +3528,12 @@
         </w:numPr>
       </w:pPr>
       <w:proofErr w:type="spellStart"/>
-      <w:proofErr w:type="gramStart"/>
       <w:r>
         <w:t>verifyToken</w:t>
       </w:r>
       <w:proofErr w:type="spellEnd"/>
       <w:r>
-        <w:t>(</w:t>
-      </w:r>
-      <w:proofErr w:type="gramEnd"/>
-      <w:r>
-        <w:t xml:space="preserve">) : Valide le jeton et injecte son contenu dans </w:t>
+        <w:t xml:space="preserve">() : Valide le jeton et injecte son contenu dans </w:t>
       </w:r>
       <w:proofErr w:type="spellStart"/>
       <w:r>
@@ -3597,17 +3553,12 @@
         </w:numPr>
       </w:pPr>
       <w:proofErr w:type="spellStart"/>
-      <w:proofErr w:type="gramStart"/>
       <w:r>
         <w:t>isAdmin</w:t>
       </w:r>
       <w:proofErr w:type="spellEnd"/>
       <w:r>
-        <w:t>(</w:t>
-      </w:r>
-      <w:proofErr w:type="gramEnd"/>
-      <w:r>
-        <w:t xml:space="preserve">) : Vérifie que </w:t>
+        <w:t xml:space="preserve">() : Vérifie que </w:t>
       </w:r>
       <w:proofErr w:type="spellStart"/>
       <w:r>
@@ -3725,7 +3676,6 @@
         <w:t xml:space="preserve"> pour chiffrer les échanges en </w:t>
       </w:r>
       <w:proofErr w:type="spellStart"/>
-      <w:proofErr w:type="gramStart"/>
       <w:r>
         <w:rPr>
           <w:rFonts w:asciiTheme="minorHAnsi" w:hAnsiTheme="minorHAnsi"/>
@@ -3735,7 +3685,6 @@
         <w:t>local.Le</w:t>
       </w:r>
       <w:proofErr w:type="spellEnd"/>
-      <w:proofErr w:type="gramEnd"/>
       <w:r>
         <w:rPr>
           <w:rFonts w:asciiTheme="minorHAnsi" w:hAnsiTheme="minorHAnsi"/>
@@ -3781,7 +3730,6 @@
         <w:t xml:space="preserve">(). Du coup, l'API écoute sur https://localhost:8080 et toutes les requêtes sont </w:t>
       </w:r>
       <w:proofErr w:type="spellStart"/>
-      <w:proofErr w:type="gramStart"/>
       <w:r>
         <w:rPr>
           <w:rFonts w:asciiTheme="minorHAnsi" w:hAnsiTheme="minorHAnsi"/>
@@ -3791,7 +3739,6 @@
         <w:t>sécurisées.C'est</w:t>
       </w:r>
       <w:proofErr w:type="spellEnd"/>
-      <w:proofErr w:type="gramEnd"/>
       <w:r>
         <w:rPr>
           <w:rFonts w:asciiTheme="minorHAnsi" w:hAnsiTheme="minorHAnsi"/>
@@ -3888,25 +3835,7 @@
           <w:sz w:val="20"/>
           <w:szCs w:val="16"/>
         </w:rPr>
-        <w:t xml:space="preserve"> sépare l'authentification en deux jetons distincts dès le </w:t>
-      </w:r>
-      <w:proofErr w:type="gramStart"/>
-      <w:r>
-        <w:rPr>
-          <w:rFonts w:asciiTheme="minorHAnsi" w:hAnsiTheme="minorHAnsi"/>
-          <w:sz w:val="20"/>
-          <w:szCs w:val="16"/>
-        </w:rPr>
-        <w:t>login(</w:t>
-      </w:r>
-      <w:proofErr w:type="gramEnd"/>
-      <w:r>
-        <w:rPr>
-          <w:rFonts w:asciiTheme="minorHAnsi" w:hAnsiTheme="minorHAnsi"/>
-          <w:sz w:val="20"/>
-          <w:szCs w:val="16"/>
-        </w:rPr>
-        <w:t xml:space="preserve">) : un Access </w:t>
+        <w:t xml:space="preserve"> sépare l'authentification en deux jetons distincts dès le login() : un Access </w:t>
       </w:r>
       <w:proofErr w:type="spellStart"/>
       <w:r>
@@ -4345,15 +4274,7 @@
         <w:t>Vulnérabilité :</w:t>
       </w:r>
       <w:r>
-        <w:t xml:space="preserve"> 0 vulnérabilité </w:t>
-      </w:r>
-      <w:proofErr w:type="gramStart"/>
-      <w:r>
-        <w:t>on</w:t>
-      </w:r>
-      <w:proofErr w:type="gramEnd"/>
-      <w:r>
-        <w:t xml:space="preserve"> été trouver après l’audit fix</w:t>
+        <w:t xml:space="preserve"> 0 vulnérabilité on été trouver après l’audit fix</w:t>
       </w:r>
     </w:p>
     <w:p>
@@ -4394,15 +4315,7 @@
         <w:t>l</w:t>
       </w:r>
       <w:r>
-        <w:t xml:space="preserve">a base et d'empêcher les hackers de tester des </w:t>
-      </w:r>
-      <w:proofErr w:type="gramStart"/>
-      <w:r>
-        <w:t>emails</w:t>
-      </w:r>
-      <w:proofErr w:type="gramEnd"/>
-      <w:r>
-        <w:t>.</w:t>
+        <w:t>a base et d'empêcher les hackers de tester des emails.</w:t>
       </w:r>
     </w:p>
     <w:p>
@@ -4521,8 +4434,8 @@
       </w:pPr>
       <w:bookmarkStart w:id="26" w:name="_Toc165969653"/>
       <w:bookmarkStart w:id="27" w:name="_Toc230167537"/>
-      <w:bookmarkEnd w:id="3"/>
       <w:bookmarkEnd w:id="4"/>
+      <w:bookmarkEnd w:id="5"/>
       <w:r>
         <w:t>Conclusion</w:t>
       </w:r>
@@ -4623,7 +4536,47 @@
           <w:sz w:val="20"/>
           <w:szCs w:val="16"/>
         </w:rPr>
-        <w:t xml:space="preserve"> au paravent et que je n’aime pas beaucoup les Framework en général.</w:t>
+        <w:t xml:space="preserve"> au paravent et que je n’aime pas beaucoup les Framework en général</w:t>
+      </w:r>
+      <w:r>
+        <w:rPr>
+          <w:color w:val="auto"/>
+          <w:sz w:val="20"/>
+          <w:szCs w:val="16"/>
+        </w:rPr>
+        <w:t xml:space="preserve">, mais en </w:t>
+      </w:r>
+      <w:r>
+        <w:rPr>
+          <w:color w:val="auto"/>
+          <w:sz w:val="20"/>
+          <w:szCs w:val="16"/>
+        </w:rPr>
+        <w:t>global</w:t>
+      </w:r>
+      <w:r>
+        <w:rPr>
+          <w:color w:val="auto"/>
+          <w:sz w:val="20"/>
+          <w:szCs w:val="16"/>
+        </w:rPr>
+        <w:t xml:space="preserve"> j’ai quand même </w:t>
+      </w:r>
+      <w:r>
+        <w:rPr>
+          <w:color w:val="auto"/>
+          <w:sz w:val="20"/>
+          <w:szCs w:val="16"/>
+        </w:rPr>
+        <w:t>apprécié</w:t>
+      </w:r>
+      <w:r>
+        <w:rPr>
+          <w:color w:val="auto"/>
+          <w:sz w:val="20"/>
+          <w:szCs w:val="16"/>
+        </w:rPr>
+        <w:t xml:space="preserve"> ce cours.</w:t>
       </w:r>
     </w:p>
     <w:sectPr>
@@ -5044,21 +4997,12 @@
               <w:szCs w:val="16"/>
             </w:rPr>
           </w:pPr>
-          <w:proofErr w:type="gramStart"/>
           <w:r>
             <w:rPr>
               <w:rFonts w:cs="Arial"/>
               <w:szCs w:val="16"/>
             </w:rPr>
-            <w:t>Version:</w:t>
-          </w:r>
-          <w:proofErr w:type="gramEnd"/>
-          <w:r>
-            <w:rPr>
-              <w:rFonts w:cs="Arial"/>
-              <w:szCs w:val="16"/>
-            </w:rPr>
-            <w:t xml:space="preserve"> </w:t>
+            <w:t xml:space="preserve">Version: </w:t>
           </w:r>
           <w:fldSimple w:instr=" REVNUM   \* MERGEFORMAT ">
             <w:r>
@@ -5104,7 +5048,7 @@
               <w:noProof/>
               <w:szCs w:val="16"/>
             </w:rPr>
-            <w:t>13.05.2026 12:12</w:t>
+            <w:t>27.05.2026 08:38</w:t>
           </w:r>
           <w:r>
             <w:rPr>
@@ -5316,7 +5260,7 @@
         <v:path o:extrusionok="f" gradientshapeok="t" o:connecttype="rect"/>
         <o:lock v:ext="edit" aspectratio="t"/>
       </v:shapetype>
-      <v:shape id="_x0000_i1088" type="#_x0000_t75" style="width:11.9pt;height:11.9pt" o:bullet="t">
+      <v:shape id="_x0000_i1030" type="#_x0000_t75" style="width:11.9pt;height:11.9pt" o:bullet="t">
         <v:imagedata r:id="rId1" o:title="BD10263_"/>
       </v:shape>
     </w:pict>
@@ -9827,6 +9771,7 @@
   <w:style w:type="character" w:default="1" w:styleId="Policepardfaut">
     <w:name w:val="Default Paragraph Font"/>
     <w:uiPriority w:val="1"/>
+    <w:semiHidden/>
     <w:unhideWhenUsed/>
   </w:style>
   <w:style w:type="table" w:default="1" w:styleId="TableauNormal">

</xml_diff>